<commit_message>
fix(docs): align Eyal pack v2.0, roadmap 12.1, migration §0 tiers; M2 v2.2; Team 90 revalidation INBOX
- Executive summary MD v2.0: accessibility, QR index, books vs archive (CC1–CC3)
- build_eyal_ceo_deliverables.py: sync body item 4; regenerate docx outputs
- ROADMAP 12.1: M6 waiver wording, X5 policy, M1 DoD, deps column, timelines, cutover note
- 06-IMPLEMENTATION v1.1 §0: 0.1 M2 vs 0.2–0.3 full migration/cutover
- M2 workplan v2.2 + §1.1 cross-refs; PROJECT-ENTRY v12.1 + tiered gates
- INBOX for Team 90 revalidation (roadmap + full M2 spec)

Made-with: Cursor
</commit_message>
<xml_diff>
--- a/docs/project/eyal-ceo-submissions-and-responses/to-eyal/2026-03-30--executive-summary--v2-final.docx
+++ b/docs/project/eyal-ceo-submissions-and-responses/to-eyal/2026-03-30--executive-summary--v2-final.docx
@@ -27,7 +27,7 @@
           <w:b w:val="0"/>
           <w:sz w:val="22"/>
         </w:rPr>
-        <w:t>גרסה: 2.0 (מסונכרן אפיון סופי)  |  תאריך: 2026-03-30</w:t>
+        <w:t>גרסה: 2.0 (מסונכרן אפיון סופי + תקציר MD v2.0)  |  תאריך: 2026-03-30</w:t>
       </w:r>
     </w:p>
     <w:p>
@@ -113,7 +113,7 @@
           <w:b w:val="0"/>
           <w:sz w:val="22"/>
         </w:rPr>
-        <w:t>1. פלטפורמה (נעול): WordPress בלבד — כל התוכן בתוך WordPress; אין חלק מהאתר מחוץ ל-WordPress. "רזה" = התקנה נקייה, תבנית מודרנית רזה ותקינה, מינימום תוספים (מוקפים ונחוצים), ניקוי פלונטרים של הפניות וקישורים שבורים, ועדכון עץ האתר לפעילותך.</w:t>
+        <w:t>1. פלטפורמה (נעול): WordPress בלבד — כל התוכן בתוך WordPress; אין חלק מהאתר מחוץ ל-WordPress. "רזה" = התקנה נקייה, תבנית מודרנית רזה ותקינה, מינימום תוספים (מוקפים ונחוצים), ניקוי פלונטרים של הפניות וקישורים שבורים, ועדכון עץ האתר לפעילותך. (ארכיון כאן = מסלול פיתוח קודם — לא לבלבל עם מבנה תוכן של ספרים.)</w:t>
       </w:r>
     </w:p>
     <w:p>
@@ -155,7 +155,7 @@
           <w:b w:val="0"/>
           <w:sz w:val="22"/>
         </w:rPr>
-        <w:t>4. הוצאה ומופע: חלק מהעבר, נשארים וחשובים — מוצגים כארכיון מותגי משני שמעשיר את האתר.</w:t>
+        <w:t>4. ספרים, הוצאה והופעות: ספרים והוצאה — מדור פעיל במבנה האתר (תפריט ראשי ותוכן), לפי מפת האתר (מוזג תחת "ספרים"; לא כ"ארכיון" ראשי). הופעות ומורשת מופע — ניווט משני (חוויית ארכיון לעבר), לא חזית המותג המרכזית — כפי שסוכם במשוב.</w:t>
       </w:r>
     </w:p>
     <w:p>
@@ -169,7 +169,7 @@
           <w:b w:val="0"/>
           <w:sz w:val="22"/>
         </w:rPr>
-        <w:t>5. חנות: ללא עגלה ותשלום באתר; עמוד קטלוג ראשי עם שמירת נתיב קיים (לא 301 תחתון במקום עמוד); חשבונית ירוקה לסליקה.</w:t>
+        <w:t>5. חנות / קטלוג: ללא עגלה ותשלום באתר; עמוד קטלוג ראשי עם שמירת נתיב קיים (לא 301 תחתון במקום עמוד); חשבונית ירוקה לסליקה חיצונית.</w:t>
       </w:r>
     </w:p>
     <w:p>

</xml_diff>